<commit_message>
lab + cv stuff
</commit_message>
<xml_diff>
--- a/static/Filip_csupka_CV.docx
+++ b/static/Filip_csupka_CV.docx
@@ -691,9 +691,17 @@
       <w:r>
         <w:rPr>
           <w:rFonts w:ascii="Arial" w:hAnsi="Arial"/>
+          <w:b/>
           <w:sz w:val="20"/>
         </w:rPr>
-        <w:t>Home lab: personal Kubernetes environment used for ArgoCD, observability tooling, sealed secrets and production-style platform experiments.</w:t>
+        <w:t xml:space="preserve">Home lab — k3s cloud + GPU node + AI stack: </w:t>
+      </w:r>
+      <w:r>
+        <w:rPr>
+          <w:rFonts w:ascii="Arial" w:hAnsi="Arial"/>
+          <w:sz w:val="20"/>
+        </w:rPr>
+        <w:t>Hetzner k3s control-plane + NVIDIA RTX 2070 GPU worker at home joined over Tailscale — one cluster, two continents. All apps deployed via ArgoCD GitOps with selfHeal and prune. AI chat (ai.filipcsupka.online): RAG chatbot on Ollama qwen3:8b, nomic-embed-text embeddings, ChromaDB vector store, FastAPI RAG API — knowledge base is markdown files updated via CI. k8s-ai-agent: AlertManager fires Prometheus alerts → LangGraph ReAct loop calls k8s API tools → Ollama diagnoses root cause → Slack report. Full observability: kube-prometheus-stack, Loki, Grafana, DCGM GPU exporter. CI/CD: GitHub Actions builds images → GHCR, ArgoCD auto-deploys. Stack: k3s, Hetzner, Tailscale, ArgoCD, Ollama, LangGraph, ChromaDB, FastAPI, Prometheus, Python.</w:t>
       </w:r>
     </w:p>
     <w:p>

</xml_diff>